<commit_message>
Docs: remove personal material list use case
The SRS has no requirement for a personal material list and the Test Plan
has no case for it, so UC-14 had nothing to trace to. Remove it from the use
case diagram and the flow document, drop the reference to it from UC-13, and
renumber UC-15 to UC-17 as UC-14 to UC-16.
</commit_message>
<xml_diff>
--- a/Documents/UseCaseFlow.docx
+++ b/Documents/UseCaseFlow.docx
@@ -4450,7 +4450,7 @@
               <w:spacing w:after="30"/>
             </w:pPr>
             <w:r>
-              <w:t xml:space="preserve">5. User opens a recommendation or adds it to their personal material list.</w:t>
+              <w:t xml:space="preserve">5. User opens a recommendation.</w:t>
             </w:r>
           </w:p>
         </w:tc>
@@ -4546,7 +4546,7 @@
           <w:sz w:val="26"/>
           <w:szCs w:val="26"/>
         </w:rPr>
-        <w:t xml:space="preserve">UC-14   Manage Personal Material List</w:t>
+        <w:t xml:space="preserve">UC-14   Track Reputation &amp; Badges</w:t>
       </w:r>
     </w:p>
     <w:tbl>
@@ -4615,7 +4615,7 @@
               <w:spacing w:after="30"/>
             </w:pPr>
             <w:r>
-              <w:t xml:space="preserve">Manage Personal Material List</w:t>
+              <w:t xml:space="preserve">Track Reputation &amp; Badges</w:t>
             </w:r>
           </w:p>
         </w:tc>
@@ -4725,31 +4725,39 @@
               <w:spacing w:after="30"/>
             </w:pPr>
             <w:r>
-              <w:t xml:space="preserve">1. User finds a material (via search or recommendations).</w:t>
-            </w:r>
-          </w:p>
-          <w:p>
-            <w:pPr>
-              <w:spacing w:after="30"/>
-            </w:pPr>
-            <w:r>
-              <w:t xml:space="preserve">2. User selects "Save to My List".</w:t>
-            </w:r>
-          </w:p>
-          <w:p>
-            <w:pPr>
-              <w:spacing w:after="30"/>
-            </w:pPr>
-            <w:r>
-              <w:t xml:space="preserve">3. The system adds the material to the user's personal list.</w:t>
-            </w:r>
-          </w:p>
-          <w:p>
-            <w:pPr>
-              <w:spacing w:after="30"/>
-            </w:pPr>
-            <w:r>
-              <w:t xml:space="preserve">4. User navigates to "My List" to view, open, or remove saved materials.</w:t>
+              <w:t xml:space="preserve">1. User performs a qualifying activity (e.g., uploads a material that receives a positive rating, contributes a question, maintains a login streak).</w:t>
+            </w:r>
+          </w:p>
+          <w:p>
+            <w:pPr>
+              <w:spacing w:after="30"/>
+            </w:pPr>
+            <w:r>
+              <w:t xml:space="preserve">2. The system calculates the reputation points earned for the activity.</w:t>
+            </w:r>
+          </w:p>
+          <w:p>
+            <w:pPr>
+              <w:spacing w:after="30"/>
+            </w:pPr>
+            <w:r>
+              <w:t xml:space="preserve">3. The system updates the user's total reputation and checks badge/milestone thresholds.</w:t>
+            </w:r>
+          </w:p>
+          <w:p>
+            <w:pPr>
+              <w:spacing w:after="30"/>
+            </w:pPr>
+            <w:r>
+              <w:t xml:space="preserve">4. If a threshold is crossed, the system awards the corresponding badge.</w:t>
+            </w:r>
+          </w:p>
+          <w:p>
+            <w:pPr>
+              <w:spacing w:after="30"/>
+            </w:pPr>
+            <w:r>
+              <w:t xml:space="preserve">5. The updated reputation and badges are reflected on the user's profile.</w:t>
             </w:r>
           </w:p>
         </w:tc>
@@ -4804,23 +4812,23 @@
               <w:spacing w:after="30"/>
             </w:pPr>
             <w:r>
-              <w:t xml:space="preserve">Material Already Saved</w:t>
-            </w:r>
-          </w:p>
-          <w:p>
-            <w:pPr>
-              <w:spacing w:after="30"/>
-            </w:pPr>
-            <w:r>
-              <w:t xml:space="preserve">At Step 3, if the material is already in the user's list:</w:t>
-            </w:r>
-          </w:p>
-          <w:p>
-            <w:pPr>
-              <w:spacing w:after="30"/>
-            </w:pPr>
-            <w:r>
-              <w:t xml:space="preserve">3a. The system displays "Already in your list" without creating a duplicate entry.</w:t>
+              <w:t xml:space="preserve">Streak Broken</w:t>
+            </w:r>
+          </w:p>
+          <w:p>
+            <w:pPr>
+              <w:spacing w:after="30"/>
+            </w:pPr>
+            <w:r>
+              <w:t xml:space="preserve">At Step 1, if the user does not meet the activity requirement for the current period:</w:t>
+            </w:r>
+          </w:p>
+          <w:p>
+            <w:pPr>
+              <w:spacing w:after="30"/>
+            </w:pPr>
+            <w:r>
+              <w:t xml:space="preserve">1a. The system resets the user's streak counter while preserving previously earned reputation and badges.</w:t>
             </w:r>
           </w:p>
         </w:tc>
@@ -4845,7 +4853,7 @@
           <w:sz w:val="26"/>
           <w:szCs w:val="26"/>
         </w:rPr>
-        <w:t xml:space="preserve">UC-15   Track Reputation &amp; Badges</w:t>
+        <w:t xml:space="preserve">UC-15   Moderate Reported Content</w:t>
       </w:r>
     </w:p>
     <w:tbl>
@@ -4914,7 +4922,7 @@
               <w:spacing w:after="30"/>
             </w:pPr>
             <w:r>
-              <w:t xml:space="preserve">Track Reputation &amp; Badges</w:t>
+              <w:t xml:space="preserve">Moderate Reported Content</w:t>
             </w:r>
           </w:p>
         </w:tc>
@@ -4969,7 +4977,7 @@
               <w:spacing w:after="30"/>
             </w:pPr>
             <w:r>
-              <w:t xml:space="preserve">Student / User</w:t>
+              <w:t xml:space="preserve">Admin / Moderator</w:t>
             </w:r>
           </w:p>
         </w:tc>
@@ -5024,39 +5032,47 @@
               <w:spacing w:after="30"/>
             </w:pPr>
             <w:r>
-              <w:t xml:space="preserve">1. User performs a qualifying activity (e.g., uploads a material that receives a positive rating, contributes a question, maintains a login streak).</w:t>
-            </w:r>
-          </w:p>
-          <w:p>
-            <w:pPr>
-              <w:spacing w:after="30"/>
-            </w:pPr>
-            <w:r>
-              <w:t xml:space="preserve">2. The system calculates the reputation points earned for the activity.</w:t>
-            </w:r>
-          </w:p>
-          <w:p>
-            <w:pPr>
-              <w:spacing w:after="30"/>
-            </w:pPr>
-            <w:r>
-              <w:t xml:space="preserve">3. The system updates the user's total reputation and checks badge/milestone thresholds.</w:t>
-            </w:r>
-          </w:p>
-          <w:p>
-            <w:pPr>
-              <w:spacing w:after="30"/>
-            </w:pPr>
-            <w:r>
-              <w:t xml:space="preserve">4. If a threshold is crossed, the system awards the corresponding badge.</w:t>
-            </w:r>
-          </w:p>
-          <w:p>
-            <w:pPr>
-              <w:spacing w:after="30"/>
-            </w:pPr>
-            <w:r>
-              <w:t xml:space="preserve">5. The updated reputation and badges are reflected on the user's profile.</w:t>
+              <w:t xml:space="preserve">1. Moderator/Admin navigates to the moderation queue.</w:t>
+            </w:r>
+          </w:p>
+          <w:p>
+            <w:pPr>
+              <w:spacing w:after="30"/>
+            </w:pPr>
+            <w:r>
+              <w:t xml:space="preserve">2. The system displays pending reports with content reference, reporter, and reason.</w:t>
+            </w:r>
+          </w:p>
+          <w:p>
+            <w:pPr>
+              <w:spacing w:after="30"/>
+            </w:pPr>
+            <w:r>
+              <w:t xml:space="preserve">3. Moderator/Admin opens a report and reviews the flagged content.</w:t>
+            </w:r>
+          </w:p>
+          <w:p>
+            <w:pPr>
+              <w:spacing w:after="30"/>
+            </w:pPr>
+            <w:r>
+              <w:t xml:space="preserve">4. Moderator/Admin selects an action: remove content, edit content, or dismiss the report.</w:t>
+            </w:r>
+          </w:p>
+          <w:p>
+            <w:pPr>
+              <w:spacing w:after="30"/>
+            </w:pPr>
+            <w:r>
+              <w:t xml:space="preserve">5. The system applies the action and updates the report status to "Resolved".</w:t>
+            </w:r>
+          </w:p>
+          <w:p>
+            <w:pPr>
+              <w:spacing w:after="30"/>
+            </w:pPr>
+            <w:r>
+              <w:t xml:space="preserve">6. The system notifies the original content owner where applicable.</w:t>
             </w:r>
           </w:p>
         </w:tc>
@@ -5111,23 +5127,23 @@
               <w:spacing w:after="30"/>
             </w:pPr>
             <w:r>
-              <w:t xml:space="preserve">Streak Broken</w:t>
-            </w:r>
-          </w:p>
-          <w:p>
-            <w:pPr>
-              <w:spacing w:after="30"/>
-            </w:pPr>
-            <w:r>
-              <w:t xml:space="preserve">At Step 1, if the user does not meet the activity requirement for the current period:</w:t>
-            </w:r>
-          </w:p>
-          <w:p>
-            <w:pPr>
-              <w:spacing w:after="30"/>
-            </w:pPr>
-            <w:r>
-              <w:t xml:space="preserve">1a. The system resets the user's streak counter while preserving previously earned reputation and badges.</w:t>
+              <w:t xml:space="preserve">Authorized Channel Escalation</w:t>
+            </w:r>
+          </w:p>
+          <w:p>
+            <w:pPr>
+              <w:spacing w:after="30"/>
+            </w:pPr>
+            <w:r>
+              <w:t xml:space="preserve">At Step 4, if the reported content is within an Authorized Channel:</w:t>
+            </w:r>
+          </w:p>
+          <w:p>
+            <w:pPr>
+              <w:spacing w:after="30"/>
+            </w:pPr>
+            <w:r>
+              <w:t xml:space="preserve">4a. Only an authorized user or admin (not a regular member) may resolve the report, per elevated moderation privileges.</w:t>
             </w:r>
           </w:p>
         </w:tc>
@@ -5152,322 +5168,7 @@
           <w:sz w:val="26"/>
           <w:szCs w:val="26"/>
         </w:rPr>
-        <w:t xml:space="preserve">UC-16   Moderate Reported Content</w:t>
-      </w:r>
-    </w:p>
-    <w:tbl>
-      <w:tblPr>
-        <w:tblW w:type="dxa" w:w="9360"/>
-        <w:tblBorders>
-          <w:top w:val="single" w:color="auto" w:sz="4"/>
-          <w:left w:val="single" w:color="auto" w:sz="4"/>
-          <w:bottom w:val="single" w:color="auto" w:sz="4"/>
-          <w:right w:val="single" w:color="auto" w:sz="4"/>
-          <w:insideH w:val="single" w:color="auto" w:sz="4"/>
-          <w:insideV w:val="single" w:color="auto" w:sz="4"/>
-        </w:tblBorders>
-      </w:tblPr>
-      <w:tblGrid>
-        <w:gridCol w:w="1800"/>
-        <w:gridCol w:w="7560"/>
-      </w:tblGrid>
-      <w:tr>
-        <w:tc>
-          <w:tcPr>
-            <w:tcW w:type="dxa" w:w="1800"/>
-            <w:tcBorders>
-              <w:top w:val="single" w:color="000000" w:sz="4"/>
-              <w:left w:val="single" w:color="000000" w:sz="4"/>
-              <w:bottom w:val="single" w:color="000000" w:sz="4"/>
-              <w:right w:val="single" w:color="000000" w:sz="4"/>
-            </w:tcBorders>
-            <w:tcMar>
-              <w:top w:type="dxa" w:w="80"/>
-              <w:left w:type="dxa" w:w="100"/>
-              <w:bottom w:type="dxa" w:w="80"/>
-              <w:right w:type="dxa" w:w="100"/>
-            </w:tcMar>
-            <w:vAlign w:val="top"/>
-          </w:tcPr>
-          <w:p>
-            <w:r>
-              <w:rPr>
-                <w:b/>
-                <w:bCs/>
-              </w:rPr>
-              <w:t xml:space="preserve">Goal</w:t>
-            </w:r>
-          </w:p>
-        </w:tc>
-        <w:tc>
-          <w:tcPr>
-            <w:tcW w:type="dxa" w:w="7560"/>
-            <w:tcBorders>
-              <w:top w:val="single" w:color="000000" w:sz="4"/>
-              <w:left w:val="single" w:color="000000" w:sz="4"/>
-              <w:bottom w:val="single" w:color="000000" w:sz="4"/>
-              <w:right w:val="single" w:color="000000" w:sz="4"/>
-            </w:tcBorders>
-            <w:tcMar>
-              <w:top w:type="dxa" w:w="80"/>
-              <w:left w:type="dxa" w:w="100"/>
-              <w:bottom w:type="dxa" w:w="80"/>
-              <w:right w:type="dxa" w:w="100"/>
-            </w:tcMar>
-            <w:vAlign w:val="top"/>
-          </w:tcPr>
-          <w:p>
-            <w:pPr>
-              <w:spacing w:after="30"/>
-            </w:pPr>
-            <w:r>
-              <w:t xml:space="preserve">Moderate Reported Content</w:t>
-            </w:r>
-          </w:p>
-        </w:tc>
-      </w:tr>
-      <w:tr>
-        <w:tc>
-          <w:tcPr>
-            <w:tcW w:type="dxa" w:w="1800"/>
-            <w:tcBorders>
-              <w:top w:val="single" w:color="000000" w:sz="4"/>
-              <w:left w:val="single" w:color="000000" w:sz="4"/>
-              <w:bottom w:val="single" w:color="000000" w:sz="4"/>
-              <w:right w:val="single" w:color="000000" w:sz="4"/>
-            </w:tcBorders>
-            <w:tcMar>
-              <w:top w:type="dxa" w:w="80"/>
-              <w:left w:type="dxa" w:w="100"/>
-              <w:bottom w:type="dxa" w:w="80"/>
-              <w:right w:type="dxa" w:w="100"/>
-            </w:tcMar>
-            <w:vAlign w:val="top"/>
-          </w:tcPr>
-          <w:p>
-            <w:r>
-              <w:rPr>
-                <w:b/>
-                <w:bCs/>
-              </w:rPr>
-              <w:t xml:space="preserve">Actor</w:t>
-            </w:r>
-          </w:p>
-        </w:tc>
-        <w:tc>
-          <w:tcPr>
-            <w:tcW w:type="dxa" w:w="7560"/>
-            <w:tcBorders>
-              <w:top w:val="single" w:color="000000" w:sz="4"/>
-              <w:left w:val="single" w:color="000000" w:sz="4"/>
-              <w:bottom w:val="single" w:color="000000" w:sz="4"/>
-              <w:right w:val="single" w:color="000000" w:sz="4"/>
-            </w:tcBorders>
-            <w:tcMar>
-              <w:top w:type="dxa" w:w="80"/>
-              <w:left w:type="dxa" w:w="100"/>
-              <w:bottom w:type="dxa" w:w="80"/>
-              <w:right w:type="dxa" w:w="100"/>
-            </w:tcMar>
-            <w:vAlign w:val="top"/>
-          </w:tcPr>
-          <w:p>
-            <w:pPr>
-              <w:spacing w:after="30"/>
-            </w:pPr>
-            <w:r>
-              <w:t xml:space="preserve">Admin / Moderator</w:t>
-            </w:r>
-          </w:p>
-        </w:tc>
-      </w:tr>
-      <w:tr>
-        <w:tc>
-          <w:tcPr>
-            <w:tcW w:type="dxa" w:w="1800"/>
-            <w:tcBorders>
-              <w:top w:val="single" w:color="000000" w:sz="4"/>
-              <w:left w:val="single" w:color="000000" w:sz="4"/>
-              <w:bottom w:val="single" w:color="000000" w:sz="4"/>
-              <w:right w:val="single" w:color="000000" w:sz="4"/>
-            </w:tcBorders>
-            <w:tcMar>
-              <w:top w:type="dxa" w:w="80"/>
-              <w:left w:type="dxa" w:w="100"/>
-              <w:bottom w:type="dxa" w:w="80"/>
-              <w:right w:type="dxa" w:w="100"/>
-            </w:tcMar>
-            <w:vAlign w:val="top"/>
-          </w:tcPr>
-          <w:p>
-            <w:r>
-              <w:rPr>
-                <w:b/>
-                <w:bCs/>
-              </w:rPr>
-              <w:t xml:space="preserve">Main flow</w:t>
-            </w:r>
-          </w:p>
-        </w:tc>
-        <w:tc>
-          <w:tcPr>
-            <w:tcW w:type="dxa" w:w="7560"/>
-            <w:tcBorders>
-              <w:top w:val="single" w:color="000000" w:sz="4"/>
-              <w:left w:val="single" w:color="000000" w:sz="4"/>
-              <w:bottom w:val="single" w:color="000000" w:sz="4"/>
-              <w:right w:val="single" w:color="000000" w:sz="4"/>
-            </w:tcBorders>
-            <w:tcMar>
-              <w:top w:type="dxa" w:w="80"/>
-              <w:left w:type="dxa" w:w="100"/>
-              <w:bottom w:type="dxa" w:w="80"/>
-              <w:right w:type="dxa" w:w="100"/>
-            </w:tcMar>
-            <w:vAlign w:val="top"/>
-          </w:tcPr>
-          <w:p>
-            <w:pPr>
-              <w:spacing w:after="30"/>
-            </w:pPr>
-            <w:r>
-              <w:t xml:space="preserve">1. Moderator/Admin navigates to the moderation queue.</w:t>
-            </w:r>
-          </w:p>
-          <w:p>
-            <w:pPr>
-              <w:spacing w:after="30"/>
-            </w:pPr>
-            <w:r>
-              <w:t xml:space="preserve">2. The system displays pending reports with content reference, reporter, and reason.</w:t>
-            </w:r>
-          </w:p>
-          <w:p>
-            <w:pPr>
-              <w:spacing w:after="30"/>
-            </w:pPr>
-            <w:r>
-              <w:t xml:space="preserve">3. Moderator/Admin opens a report and reviews the flagged content.</w:t>
-            </w:r>
-          </w:p>
-          <w:p>
-            <w:pPr>
-              <w:spacing w:after="30"/>
-            </w:pPr>
-            <w:r>
-              <w:t xml:space="preserve">4. Moderator/Admin selects an action: remove content, edit content, or dismiss the report.</w:t>
-            </w:r>
-          </w:p>
-          <w:p>
-            <w:pPr>
-              <w:spacing w:after="30"/>
-            </w:pPr>
-            <w:r>
-              <w:t xml:space="preserve">5. The system applies the action and updates the report status to "Resolved".</w:t>
-            </w:r>
-          </w:p>
-          <w:p>
-            <w:pPr>
-              <w:spacing w:after="30"/>
-            </w:pPr>
-            <w:r>
-              <w:t xml:space="preserve">6. The system notifies the original content owner where applicable.</w:t>
-            </w:r>
-          </w:p>
-        </w:tc>
-      </w:tr>
-      <w:tr>
-        <w:tc>
-          <w:tcPr>
-            <w:tcW w:type="dxa" w:w="1800"/>
-            <w:tcBorders>
-              <w:top w:val="single" w:color="000000" w:sz="4"/>
-              <w:left w:val="single" w:color="000000" w:sz="4"/>
-              <w:bottom w:val="single" w:color="000000" w:sz="4"/>
-              <w:right w:val="single" w:color="000000" w:sz="4"/>
-            </w:tcBorders>
-            <w:tcMar>
-              <w:top w:type="dxa" w:w="80"/>
-              <w:left w:type="dxa" w:w="100"/>
-              <w:bottom w:type="dxa" w:w="80"/>
-              <w:right w:type="dxa" w:w="100"/>
-            </w:tcMar>
-            <w:vAlign w:val="top"/>
-          </w:tcPr>
-          <w:p>
-            <w:r>
-              <w:rPr>
-                <w:b/>
-                <w:bCs/>
-              </w:rPr>
-              <w:t xml:space="preserve">Alternate Flow</w:t>
-            </w:r>
-          </w:p>
-        </w:tc>
-        <w:tc>
-          <w:tcPr>
-            <w:tcW w:type="dxa" w:w="7560"/>
-            <w:tcBorders>
-              <w:top w:val="single" w:color="000000" w:sz="4"/>
-              <w:left w:val="single" w:color="000000" w:sz="4"/>
-              <w:bottom w:val="single" w:color="000000" w:sz="4"/>
-              <w:right w:val="single" w:color="000000" w:sz="4"/>
-            </w:tcBorders>
-            <w:tcMar>
-              <w:top w:type="dxa" w:w="80"/>
-              <w:left w:type="dxa" w:w="100"/>
-              <w:bottom w:type="dxa" w:w="80"/>
-              <w:right w:type="dxa" w:w="100"/>
-            </w:tcMar>
-            <w:vAlign w:val="top"/>
-          </w:tcPr>
-          <w:p>
-            <w:pPr>
-              <w:spacing w:after="30"/>
-            </w:pPr>
-            <w:r>
-              <w:t xml:space="preserve">Authorized Channel Escalation</w:t>
-            </w:r>
-          </w:p>
-          <w:p>
-            <w:pPr>
-              <w:spacing w:after="30"/>
-            </w:pPr>
-            <w:r>
-              <w:t xml:space="preserve">At Step 4, if the reported content is within an Authorized Channel:</w:t>
-            </w:r>
-          </w:p>
-          <w:p>
-            <w:pPr>
-              <w:spacing w:after="30"/>
-            </w:pPr>
-            <w:r>
-              <w:t xml:space="preserve">4a. Only an authorized user or admin (not a regular member) may resolve the report, per elevated moderation privileges.</w:t>
-            </w:r>
-          </w:p>
-        </w:tc>
-      </w:tr>
-    </w:tbl>
-    <w:p>
-      <w:pPr>
-        <w:spacing w:after="160"/>
-      </w:pPr>
-      <w:r>
-        <w:t xml:space="preserve"/>
-      </w:r>
-    </w:p>
-    <w:p>
-      <w:pPr>
-        <w:spacing w:after="100" w:before="320"/>
-      </w:pPr>
-      <w:r>
-        <w:rPr>
-          <w:b/>
-          <w:bCs/>
-          <w:sz w:val="26"/>
-          <w:szCs w:val="26"/>
-        </w:rPr>
-        <w:t xml:space="preserve">UC-17   Manage Users &amp; Channels</w:t>
+        <w:t xml:space="preserve">UC-16   Manage Users &amp; Channels</w:t>
       </w:r>
     </w:p>
     <w:tbl>

</xml_diff>